<commit_message>
feat: mejorar terminal C++ y validación de Supabase
Co-authored-by: Copilot <223556219+Copilot@users.noreply.github.com>
</commit_message>
<xml_diff>
--- a/entrega/Especificacion_Tecnica_PEAi.docx
+++ b/entrega/Especificacion_Tecnica_PEAi.docx
@@ -100,7 +100,7 @@
         <w:pStyle w:val="FirstParagraph"/>
       </w:pPr>
       <w:r>
-        <w:t xml:space="preserve">El proyecto contempla dos aplicaciones nativas de escritorio: Python 3.12 o superior con PySide6 y C++17 con Qt 6 Widgets. Ambas comparten el mismo proyecto PostgreSQL de Supabase y se comunican exclusivamente por HTTPS mediante REST/RPC.</w:t>
+        <w:t>El proyecto contempla una aplicación de escritorio Python 3.12 o superior con PySide6 y una aplicación C++17 de terminal con FTXUI 5.0.0. Ambas comparten el mismo proyecto PostgreSQL de Supabase y se comunican exclusivamente por HTTPS mediante REST/RPC.</w:t>
       </w:r>
     </w:p>
     <w:p>
@@ -108,20 +108,7 @@
         <w:pStyle w:val="BodyText"/>
       </w:pPr>
       <w:r>
-        <w:t xml:space="preserve">La entrega Python incluye la interfaz Qt Widgets y la arquitectura modular. La sección de C++ queda</w:t>
-      </w:r>
-      <w:r>
-        <w:t xml:space="preserve"> </w:t>
-      </w:r>
-      <w:r>
-        <w:rPr>
-          <w:b/>
-          <w:bCs/>
-        </w:rPr>
-        <w:t xml:space="preserve">pendiente y se rehace en terminal</w:t>
-      </w:r>
-      <w:r>
-        <w:t xml:space="preserve">, según la instrucción de esta entrega. No se presentan los conteos reales de Supabase como verificados: dependen de ejecutar el contrato remoto con la sesión normal de pruebas configurada.</w:t>
+        <w:t>La entrega Python incluye la interfaz Qt Widgets y la arquitectura modular. La sección C++ se implementa como TUI/CLI. Su cobertura actual es parcial y se detallan las funciones pendientes en la matriz de paridad. No se presentan los conteos reales de Supabase como verificados: dependen de ejecutar el contrato remoto con la sesión normal de pruebas configurada.</w:t>
       </w:r>
     </w:p>
     <w:bookmarkEnd w:id="10"/>
@@ -151,17 +138,7 @@
         </w:numPr>
       </w:pPr>
       <w:r>
-        <w:rPr>
-          <w:b/>
-          <w:bCs/>
-        </w:rPr>
-        <w:t xml:space="preserve">Presentación:</w:t>
-      </w:r>
-      <w:r>
-        <w:t xml:space="preserve"> </w:t>
-      </w:r>
-      <w:r>
-        <w:t xml:space="preserve">ventanas y componentes de Qt Widgets; no accede directamente a SQL, red ni estructuras.</w:t>
+        <w:t>Presentación: GUI PySide6 en Python y terminal FTXUI en C++; no accede directamente a SQL, red ni estructuras.</w:t>
       </w:r>
     </w:p>
     <w:p>
@@ -1450,11 +1427,65 @@
         </w:numPr>
       </w:pPr>
       <w:r>
-        <w:t xml:space="preserve">La implementación C++ queda pendiente y se rehace en terminal.</w:t>
+        <w:t>La implementación C++ ya dispone de CLI, navegación TUI, resumen/directorios de lectura, filtros estadísticos base y pruebas de terminal; formularios CRUD, gráficos, edición completa y varias vistas siguen pendientes.</w:t>
       </w:r>
     </w:p>
     <w:bookmarkEnd w:id="19"/>
     <w:bookmarkEnd w:id="20"/>
+    <w:p>
+      <w:pPr>
+        <w:pStyle w:val="Heading2"/>
+      </w:pPr>
+      <w:r>
+        <w:t>12. Implementación C++ en terminal</w:t>
+      </w:r>
+    </w:p>
+    <w:p>
+      <w:r>
+        <w:t>La aplicación C++ usa una única entrada, pea::ejecutar_aplicacion, y selecciona la CLI cuando recibe argumentos; sin argumentos abre la terminal interactiva. FTXUI v5.0.0 se obtiene mediante FetchContent con etiqueta fija. Qt6 Core y Network se mantienen para JSON y HTTPS; Qt Widgets y QApplication no forman parte de la aplicación C++.</w:t>
+      </w:r>
+    </w:p>
+    <w:p>
+      <w:r>
+        <w:t>La TUI presenta ocho pestañas, navegación con teclado, resumen institucional y directorios de lectura. La configuración de Supabase se carga automáticamente; si no hay configuración se muestra el estado sin datos. --demo introduce datos sintéticos PRUEBA- solo en memoria. La carga remota se hace con el catálogo de servicios y no se verificó contra la instancia remota en esta sesión.</w:t>
+      </w:r>
+    </w:p>
+    <w:p>
+      <w:r>
+        <w:t>La autoprueba pea-cpp --autoprueba renderiza las ocho pantallas en 80x24, 100x28, 120x35 y 160x50, guarda 32 capturas sin color bajo datos/capturas/terminal/ y reporta cero hallazgos de ancho Unicode, reemplazo, salida vacía o escritura de capturas.</w:t>
+      </w:r>
+    </w:p>
+    <w:p>
+      <w:r>
+        <w:t>La CLI ofrece info, verificar/ping, resumen --json, importar-csv, importar-url, exportar-csv, cargar-ejemplo y aplicar-escenario. La salida JSON todavía requiere comparación byte a byte con Python antes de declarar paridad.</w:t>
+      </w:r>
+    </w:p>
+    <w:p>
+      <w:pPr>
+        <w:pStyle w:val="Heading3"/>
+      </w:pPr>
+      <w:r>
+        <w:t>12.1 Límites funcionales actuales</w:t>
+      </w:r>
+    </w:p>
+    <w:p>
+      <w:r>
+        <w:t>Las pestañas de redes e importación siguen siendo informativas, no formularios operativos. Las pantallas carecen de CRUD interactivo, ficha completa, filtros interactivos, gráficos, selector de tema y revisión remota periódica. La autoprueba valida dimensiones y capturas, pero todavía no compara snapshots ni detecta todos los textos truncados. Ver brain/60-Pruebas/Paridad-Python-Cpp.md para el estado por función.</w:t>
+      </w:r>
+    </w:p>
+    <w:p>
+      <w:pPr>
+        <w:pStyle w:val="Heading3"/>
+      </w:pPr>
+      <w:r>
+        <w:t>12.2 Evidencia local</w:t>
+      </w:r>
+    </w:p>
+    <w:p>
+      <w:r>
+        <w:t>En la verificación local de esta iteración, CMake compiló con -Wall -Wextra -Wpedantic -Werror, CTest aprobó la suite C++ y la autoprueba generó 32 capturas con cero hallazgos. No se hicieron escrituras remotas ni se confirmó conectividad autenticada con pea-prod.</w:t>
+      </w:r>
+    </w:p>
     <w:sectPr>
       <w:footnotePr>
         <w:numRestart w:val="eachSect"/>

</xml_diff>